<commit_message>
Puntualidad docente: mensaje de Diana (vision del entrenamiento), foto con salon vacio, Jacqueline da fe, tarde desde el minuto 1 (docx; PDF pendiente de cerrar)
Co-Authored-By: Claude Fable 5.1 <noreply@anthropic.com>
</commit_message>
<xml_diff>
--- a/documentos_operativos/politicas/INSTRUCCIONES_JACQUELINE_PUNTUALIDAD_DOCENTE_2026-10-14.docx
+++ b/documentos_operativos/politicas/INSTRUCCIONES_JACQUELINE_PUNTUALIDAD_DOCENTE_2026-10-14.docx
@@ -70,7 +70,7 @@
         <w:rPr>
           <w:sz w:val="20"/>
         </w:rPr>
-        <w:t>A la hora exacta de inicio de cada clase, el docente envía al grupo de docentes la FOTO del tablero con la Frase del Día escrita. La hora del mensaje es la hora de inicio real. Sin foto = clase iniciada tarde.</w:t>
+        <w:t>Antes de que entre el primer estudiante, el docente escribe la Frase del Día en el tablero y envía la FOTO al grupo de docentes. La hora de ese mensaje es la hora de inicio real. La foto se toma con el salón vacío: "estaba en clase" o "el estudiante no me dejó" no aplican, porque si ya había estudiante y no había foto, llegó con él o después. Cuando Jacqueline está en la sede, su registro de la hora de llegada es el que vale, por encima de la foto. Sin foto y sin registro de Jacqueline = clase iniciada tarde.</w:t>
       </w:r>
     </w:p>
     <w:p>
@@ -89,7 +89,7 @@
         <w:rPr>
           <w:sz w:val="20"/>
         </w:rPr>
-        <w:t>Cada bloque de 15 minutos iniciado tarde se descuenta de la liquidación del mes (la fracción de hora no impartida no se paga). Hasta 5 minutos no cuenta. Tres clases tarde en el mes: llamado de atención por escrito de Diana. Ninguna situación se resuelve en el grupo: quien tenga una razón la escribe a Jacqueline ese mismo día.</w:t>
+        <w:t>Llegar tarde es llegar tarde: desde el minuto 1 queda registrado como clase iniciada tarde. Tres clases tarde en el mes: llamado de atención por escrito de Diana. El descuento corre por bloques: cada bloque de 15 minutos iniciado tarde se descuenta de la liquidación del mes (la fracción de hora no impartida no se paga). Ninguna situación se resuelve en el grupo: quien tenga una razón la escribe a Jacqueline ese mismo día.</w:t>
       </w:r>
     </w:p>
     <w:p>
@@ -218,7 +218,7 @@
                 <w:color w:val="FFFFFF"/>
                 <w:sz w:val="18"/>
               </w:rPr>
-              <w:t>Hora de la foto</w:t>
+              <w:t>Hora de la foto / llegada</w:t>
             </w:r>
           </w:p>
         </w:tc>
@@ -630,13 +630,33 @@
                 <w:i/>
                 <w:sz w:val="19"/>
               </w:rPr>
-              <w:t>Equipo, desde el lunes 19 de octubre arranca el registro de inicio de clase. A la hora exacta de inicio, cada uno envía a este grupo</w:t>
+              <w:t>Profesores, les quiero recalcar lo que estamos construyendo. El programa que he venido desarrollando no busca solo enseñar inglés: busca formar al</w:t>
               <w:br/>
-              <w:t>la foto del tablero con la Frase del Día. Esa hora es la hora de inicio real. Como dice el contrato, se paga por horas efectivamente</w:t>
+              <w:t>estudiante desde el ser. Es un programa distinto al de cualquier academia, y solo funciona si todos lo ejecutamos igual. Si no, lo que vendemos en la</w:t>
               <w:br/>
-              <w:t>impartidas: cada bloque de 15 minutos iniciado tarde se descuenta en la liquidación del mes (hasta 5 minutos no cuenta).</w:t>
+              <w:t>parte comercial no se ve en el aula y no cumplimos lo que prometimos.</w:t>
               <w:br/>
-              <w:t>No es un regaño: es un registro, y corre igual para todos. Cualquier situación se escribe a Jacqueline el mismo día. Gracias.</w:t>
+              <w:t>Hoy el programa evolucionó a esto: vendemos un entrenamiento tipo batallón, un bootcamp. Nada de eso es fácil. La competencia vende inglés fácil,</w:t>
+              <w:br/>
+              <w:t>flexible y divertido; nosotros vendemos lo contrario: mentoría, acompañamiento, constancia, disciplina y, sí, algo de dolor. Y nos rodeamos de gente</w:t>
+              <w:br/>
+              <w:t>emprendedora, líder, que quiere estar en el top, para lograr resultados que se puedan firmar.</w:t>
+              <w:br/>
+              <w:t>Eso lo tenemos que poder expresar todos. Estamos firmando garantías y un trabajo duro: video todos los días, asistencia, un ritmo que no se baja.</w:t>
+              <w:br/>
+              <w:t>Le pedimos al estudiante disciplina de soldado porque quiere subir de rango: un ascenso, una entrevista, una visa. Y un soldado así necesita un líder</w:t>
+              <w:br/>
+              <w:t>que llegue antes que él. Un coach que llega tarde no puede exigir puntualidad, ni tarea, ni ritmo: pierde la autoridad en el primer minuto.</w:t>
+              <w:br/>
+              <w:t>Por eso desde el lunes 19 de octubre arranca el registro de inicio de clase. Antes de que entre el primer estudiante, cada uno escribe la Frase del Día</w:t>
+              <w:br/>
+              <w:t>en el tablero y envía la foto a este grupo. La hora de esa foto es la hora de inicio real; cuando Jacqueline está en la sede, su registro es el que vale.</w:t>
+              <w:br/>
+              <w:t>Llegar tarde es llegar tarde: desde el primer minuto queda registrado. Como dice el contrato, se paga por horas efectivamente impartidas: cada bloque</w:t>
+              <w:br/>
+              <w:t>de 15 minutos iniciado tarde se descuenta en la liquidación del mes. Corre igual para todos. Cualquier situación se escribe a Jacqueline el mismo día.</w:t>
+              <w:br/>
+              <w:t>El profe que está a las 7:50 con la frase en el tablero ya ganó la clase antes de empezarla. Así se lidera a alguien que quiere subir de rango. Gracias.</w:t>
             </w:r>
           </w:p>
         </w:tc>

</xml_diff>

<commit_message>
Puntualidad docente: parrafo 'para estar en el top hay que rodearse de los top'
Co-Authored-By: Claude Fable 5.1 <noreply@anthropic.com>
</commit_message>
<xml_diff>
--- a/documentos_operativos/politicas/INSTRUCCIONES_JACQUELINE_PUNTUALIDAD_DOCENTE_2026-10-14.docx
+++ b/documentos_operativos/politicas/INSTRUCCIONES_JACQUELINE_PUNTUALIDAD_DOCENTE_2026-10-14.docx
@@ -638,9 +638,11 @@
               <w:br/>
               <w:t>Hoy el programa evolucionó a esto: vendemos un entrenamiento tipo batallón, un bootcamp. Nada de eso es fácil. La competencia vende inglés fácil,</w:t>
               <w:br/>
-              <w:t>flexible y divertido; nosotros vendemos lo contrario: mentoría, acompañamiento, constancia, disciplina y, sí, algo de dolor. Y nos rodeamos de gente</w:t>
+              <w:t>flexible y divertido; nosotros vendemos lo contrario: mentoría, acompañamiento, constancia, disciplina y, sí, algo de dolor. Y lo que repiten los</w:t>
               <w:br/>
-              <w:t>emprendedora, líder, que quiere estar en el top, para lograr resultados que se puedan firmar.</w:t>
+              <w:t>grandes: para estar en el top hay que rodearse de los top y hacer cosas top. Por eso nos rodeamos de gente emprendedora, líder, que quiere estar</w:t>
+              <w:br/>
+              <w:t>ahí arriba. Y por eso cada uno de nosotros tiene que ser top en lo suyo: un estudiante que paga por ser top no puede tener un profe promedio.</w:t>
               <w:br/>
               <w:t>Eso lo tenemos que poder expresar todos. Estamos firmando garantías y un trabajo duro: video todos los días, asistencia, un ritmo que no se baja.</w:t>
               <w:br/>

</xml_diff>

<commit_message>
Puntualidad docente: 'uno se junta con top y es top', con nombres
Co-Authored-By: Claude Fable 5.1 <noreply@anthropic.com>
</commit_message>
<xml_diff>
--- a/documentos_operativos/politicas/INSTRUCCIONES_JACQUELINE_PUNTUALIDAD_DOCENTE_2026-10-14.docx
+++ b/documentos_operativos/politicas/INSTRUCCIONES_JACQUELINE_PUNTUALIDAD_DOCENTE_2026-10-14.docx
@@ -640,9 +640,9 @@
               <w:br/>
               <w:t>flexible y divertido; nosotros vendemos lo contrario: mentoría, acompañamiento, constancia, disciplina y, sí, algo de dolor. Y lo que repiten los</w:t>
               <w:br/>
-              <w:t>grandes: para estar en el top hay que rodearse de los top y hacer cosas top. Por eso nos rodeamos de gente emprendedora, líder, que quiere estar</w:t>
+              <w:t>grandes, Steve Jobs, Elon Musk: para estar en el top hay que rodearse de los top y hacer cosas top. Uno se junta con top y es top. Punto.</w:t>
               <w:br/>
-              <w:t>ahí arriba. Y por eso cada uno de nosotros tiene que ser top en lo suyo: un estudiante que paga por ser top no puede tener un profe promedio.</w:t>
+              <w:t>Por eso nos rodeamos de gente emprendedora, líder, que quiere estar ahí arriba. Y por eso cada uno de nosotros tiene que ser top en lo suyo: un estudiante que paga por ser top no puede tener un profe promedio.</w:t>
               <w:br/>
               <w:t>Eso lo tenemos que poder expresar todos. Estamos firmando garantías y un trabajo duro: video todos los días, asistencia, un ritmo que no se baja.</w:t>
               <w:br/>

</xml_diff>

<commit_message>
Puntualidad docente: 'no es el trabajo de Jacqueline' antes de la regla
Co-Authored-By: Claude Fable 5.1 <noreply@anthropic.com>
</commit_message>
<xml_diff>
--- a/documentos_operativos/politicas/INSTRUCCIONES_JACQUELINE_PUNTUALIDAD_DOCENTE_2026-10-14.docx
+++ b/documentos_operativos/politicas/INSTRUCCIONES_JACQUELINE_PUNTUALIDAD_DOCENTE_2026-10-14.docx
@@ -650,6 +650,10 @@
               <w:br/>
               <w:t>que llegue antes que él. Un coach que llega tarde no puede exigir puntualidad, ni tarea, ni ritmo: pierde la autoridad en el primer minuto.</w:t>
               <w:br/>
+              <w:t>Pero no podemos tener a Jacqueline encima de ustedes pidiéndoles que lleguen a tiempo o llamándolos porque no han llegado. Eso no es</w:t>
+              <w:br/>
+              <w:t>comportamiento top. No es el trabajo de Jacqueline.</w:t>
+              <w:br/>
               <w:t>Por eso desde el lunes 19 de octubre arranca el registro de inicio de clase. Antes de que entre el primer estudiante, cada uno escribe la Frase del Día</w:t>
               <w:br/>
               <w:t>en el tablero y envía la foto a este grupo. La hora de esa foto es la hora de inicio real; cuando Jacqueline está en la sede, su registro es el que vale.</w:t>

</xml_diff>

<commit_message>
Puntualidad docente: la prueba es el registro de Jacqueline, la foto es opcional
Co-Authored-By: Claude Fable 5.1 <noreply@anthropic.com>
</commit_message>
<xml_diff>
--- a/documentos_operativos/politicas/INSTRUCCIONES_JACQUELINE_PUNTUALIDAD_DOCENTE_2026-10-14.docx
+++ b/documentos_operativos/politicas/INSTRUCCIONES_JACQUELINE_PUNTUALIDAD_DOCENTE_2026-10-14.docx
@@ -70,7 +70,7 @@
         <w:rPr>
           <w:sz w:val="20"/>
         </w:rPr>
-        <w:t>Antes de que entre el primer estudiante, el docente escribe la Frase del Día en el tablero y envía la FOTO al grupo de docentes. La hora de ese mensaje es la hora de inicio real. La foto se toma con el salón vacío: "estaba en clase" o "el estudiante no me dejó" no aplican, porque si ya había estudiante y no había foto, llegó con él o después. Cuando Jacqueline está en la sede, su registro de la hora de llegada es el que vale, por encima de la foto. Sin foto y sin registro de Jacqueline = clase iniciada tarde.</w:t>
+        <w:t>Jacqueline anota en la tabla la hora a la que cada docente entra al salón, en cada clase. Esa es la hora de inicio real y la única prueba. No le pide nada al docente ni lo llama: anota. La Frase del Día debe estar en el tablero antes de que entre el primer estudiante; la foto al grupo de docentes es opcional y no sirve como prueba de hora.</w:t>
       </w:r>
     </w:p>
     <w:p>
@@ -218,7 +218,7 @@
                 <w:color w:val="FFFFFF"/>
                 <w:sz w:val="18"/>
               </w:rPr>
-              <w:t>Hora de la foto / llegada</w:t>
+              <w:t>Hora de llegada (Jacqueline)</w:t>
             </w:r>
           </w:p>
         </w:tc>
@@ -654,11 +654,11 @@
               <w:br/>
               <w:t>comportamiento top. No es el trabajo de Jacqueline.</w:t>
               <w:br/>
-              <w:t>Por eso desde el lunes 19 de octubre arranca el registro de inicio de clase. Antes de que entre el primer estudiante, cada uno escribe la Frase del Día</w:t>
+              <w:t>Por eso desde el lunes 19 de octubre arranca el registro de inicio de clase. Jacqueline anota la hora a la que cada uno entra al salón; esa es la hora</w:t>
               <w:br/>
-              <w:t>en el tablero y envía la foto a este grupo. La hora de esa foto es la hora de inicio real; cuando Jacqueline está en la sede, su registro es el que vale.</w:t>
+              <w:t>de inicio real. No les va a pedir nada ni a llamarlos: anota, y ya. La Frase del Día tiene que estar en el tablero antes de que entre el primer</w:t>
               <w:br/>
-              <w:t>Llegar tarde es llegar tarde: desde el primer minuto queda registrado. Como dice el contrato, se paga por horas efectivamente impartidas: cada bloque</w:t>
+              <w:t>estudiante; la foto al grupo la pueden mandar si quieren, pero no es la prueba. Llegar tarde es llegar tarde: desde el primer minuto queda registrado. Como dice el contrato, se paga por horas efectivamente impartidas: cada bloque</w:t>
               <w:br/>
               <w:t>de 15 minutos iniciado tarde se descuenta en la liquidación del mes. Corre igual para todos. Cualquier situación se escribe a Jacqueline el mismo día.</w:t>
               <w:br/>
@@ -801,7 +801,7 @@
         <w:rPr>
           <w:sz w:val="20"/>
         </w:rPr>
-        <w:t>Mañana: anotar la hora de la foto de cada clase en la tabla semanal (aunque la regla rija desde el lunes 19, la tabla se empieza a llenar ya).</w:t>
+        <w:t>Mañana: anotar la hora de llegada de cada docente en la tabla semanal (aunque la regla rija desde el lunes 19, la tabla se empieza a llenar ya).</w:t>
       </w:r>
     </w:p>
     <w:p>

</xml_diff>

<commit_message>
Puntualidad docente: docx y PDF finales regenerados (solo puntualidad, mensaje del 14/10)
Co-Authored-By: Claude Fable 5.1 <noreply@anthropic.com>
</commit_message>
<xml_diff>
--- a/documentos_operativos/politicas/INSTRUCCIONES_JACQUELINE_PUNTUALIDAD_DOCENTE_2026-10-14.docx
+++ b/documentos_operativos/politicas/INSTRUCCIONES_JACQUELINE_PUNTUALIDAD_DOCENTE_2026-10-14.docx
@@ -603,7 +603,7 @@
           <w:b/>
           <w:sz w:val="20"/>
         </w:rPr>
-        <w:t>Mensaje de Diana al grupo de docentes (se envía hoy; rige desde el lunes 19):</w:t>
+        <w:t>Mensaje de Diana al grupo de docentes (enviado el 14/10; rige desde el lunes 19):</w:t>
       </w:r>
     </w:p>
     <w:tbl>
@@ -630,19 +630,25 @@
                 <w:i/>
                 <w:sz w:val="19"/>
               </w:rPr>
-              <w:t>Profesores, les quiero recalcar lo que estamos construyendo. El programa que he venido desarrollando no busca solo enseñar inglés: busca formar al</w:t>
+              <w:t>Profesores, les quiero recalcar lo que estamos construyendo.</w:t>
               <w:br/>
-              <w:t>estudiante desde el ser. Es un programa distinto al de cualquier academia, y solo funciona si todos lo ejecutamos igual. Si no, lo que vendemos en la</w:t>
+              <w:t>El programa que he venido desarrollando no busca solo enseñar inglés: busca formar al estudiante desde el ser. Por eso los valores, la puntualidad,</w:t>
               <w:br/>
-              <w:t>parte comercial no se ve en el aula y no cumplimos lo que prometimos.</w:t>
+              <w:t>formar el carácter desde hacer cosas que no nos gustan, etc. Es un programa distinto al de cualquier academia, y solo funciona si todos lo ejecutamos</w:t>
+              <w:br/>
+              <w:t>igual. Si no, lo que vendemos en la parte comercial no se ve en el aula y no cumplimos lo que prometimos.</w:t>
               <w:br/>
               <w:t>Hoy el programa evolucionó a esto: vendemos un entrenamiento tipo batallón, un bootcamp. Nada de eso es fácil. La competencia vende inglés fácil,</w:t>
               <w:br/>
-              <w:t>flexible y divertido; nosotros vendemos lo contrario: mentoría, acompañamiento, constancia, disciplina y, sí, algo de dolor. Y lo que repiten los</w:t>
+              <w:t>flexible y divertido; nosotros vendemos lo contrario: mentoría, acompañamiento, constancia, disciplina y, sí, algo de dolor.</w:t>
               <w:br/>
-              <w:t>grandes, Steve Jobs, Elon Musk: para estar en el top hay que rodearse de los top y hacer cosas top. Uno se junta con top y es top. Punto.</w:t>
+              <w:t>Muchos hemos leído lo que predican grandes como Steve Jobs, Elon Musk y muchos otros: para estar en el top hay que rodearse de los top y hacer cosas</w:t>
               <w:br/>
-              <w:t>Por eso nos rodeamos de gente emprendedora, líder, que quiere estar ahí arriba. Y por eso cada uno de nosotros tiene que ser top en lo suyo: un estudiante que paga por ser top no puede tener un profe promedio.</w:t>
+              <w:t>top. Uno se junta con top y es top. Punto.</w:t>
+              <w:br/>
+              <w:t>Por eso nos rodeamos de gente emprendedora, líder, que quiere estar ahí arriba. Y por eso cada uno de nosotros tiene que ser top en lo suyo: un</w:t>
+              <w:br/>
+              <w:t>estudiante que paga por ser top no puede tener un profe promedio. Entonces debe empezar por nosotros.</w:t>
               <w:br/>
               <w:t>Eso lo tenemos que poder expresar todos. Estamos firmando garantías y un trabajo duro: video todos los días, asistencia, un ritmo que no se baja.</w:t>
               <w:br/>
@@ -650,17 +656,19 @@
               <w:br/>
               <w:t>que llegue antes que él. Un coach que llega tarde no puede exigir puntualidad, ni tarea, ni ritmo: pierde la autoridad en el primer minuto.</w:t>
               <w:br/>
-              <w:t>Pero no podemos tener a Jacqueline encima de ustedes pidiéndoles que lleguen a tiempo o llamándolos porque no han llegado. Eso no es</w:t>
+              <w:t>Entonces no podemos tener a Jacqueline encima de ustedes pidiéndoles que lleguen a tiempo o llamándolos porque no han llegado. Eso no es</w:t>
               <w:br/>
               <w:t>comportamiento top. No es el trabajo de Jacqueline.</w:t>
               <w:br/>
               <w:t>Por eso desde el lunes 19 de octubre arranca el registro de inicio de clase. Jacqueline anota la hora a la que cada uno entra al salón; esa es la hora</w:t>
               <w:br/>
-              <w:t>de inicio real. No les va a pedir nada ni a llamarlos: anota, y ya. La Frase del Día tiene que estar en el tablero antes de que entre el primer</w:t>
+              <w:t>de inicio real. No les va a pedir nada ni a llamarlos.</w:t>
               <w:br/>
-              <w:t>estudiante; la foto al grupo la pueden mandar si quieren, pero no es la prueba. Llegar tarde es llegar tarde: desde el primer minuto queda registrado. Como dice el contrato, se paga por horas efectivamente impartidas: cada bloque</w:t>
+              <w:t>Llegar tarde es llegar tarde: desde el primer minuto queda registrado. Como dice el contrato, se paga por horas efectivamente impartidas: cada bloque</w:t>
               <w:br/>
-              <w:t>de 15 minutos iniciado tarde se descuenta en la liquidación del mes. Corre igual para todos. Cualquier situación se escribe a Jacqueline el mismo día.</w:t>
+              <w:t>de 15 minutos iniciado tarde se descuenta en la liquidación del mes. Corre igual para todos.</w:t>
+              <w:br/>
+              <w:t>Cualquier situación se escribe a Jacqueline el mismo día.</w:t>
               <w:br/>
               <w:t>El profe que está a las 7:50 con la frase en el tablero ya ganó la clase antes de empezarla. Así se lidera a alguien que quiere subir de rango. Gracias.</w:t>
             </w:r>

</xml_diff>